<commit_message>
docs: finalize high-end README and Team 046 project report; feat: implement auto-fill for Admin/Staff demo logins
</commit_message>
<xml_diff>
--- a/Team_046_Project_Report.docx
+++ b/Team_046_Project_Report.docx
@@ -228,7 +228,7 @@
     </w:p>
     <w:p>
       <w:r>
-        <w:t>The backbone of our system is a modern "Separation of Concerns" architecture. We use React for a dynamic, reactive frontend, ServiceNow for the enterprise-grade database and business logic, and Supabase for secure, scalable authentication.</w:t>
+        <w:t>The backbone of our system is a modern "Separation of Concerns" architecture. We use a premium React Web Application for a dynamic, reactive experience, ServiceNow for the enterprise-grade database and business logic, and Supabase for secure, scalable authentication.</w:t>
       </w:r>
     </w:p>
     <w:p>
@@ -244,7 +244,7 @@
               <a:graphicData uri="http://schemas.openxmlformats.org/drawingml/2006/picture">
                 <pic:pic>
                   <pic:nvPicPr>
-                    <pic:cNvPr id="0" name="hotel_system_architecture_1778571364544.png"/>
+                    <pic:cNvPr id="0" name="hotel_web_architecture_v2_1778576742656.png"/>
                     <pic:cNvPicPr/>
                   </pic:nvPicPr>
                   <pic:blipFill>
@@ -276,7 +276,7 @@
           <w:i/>
           <w:sz w:val="18"/>
         </w:rPr>
-        <w:t>Figure 1: Smart Hotel High-Level Architecture Diagram</w:t>
+        <w:t>Figure 1: Smart Hotel Web Architecture &amp; Notifications Service</w:t>
       </w:r>
     </w:p>
     <w:p>

</xml_diff>